<commit_message>
Add Report.docx and test suites (Django + pure-Python harness)
</commit_message>
<xml_diff>
--- a/Report.docx
+++ b/Report.docx
@@ -6,8 +6,7 @@
       <w:pPr>
         <w:pStyle w:val="papertitle"/>
         <w:spacing w:before="100" w:after="100"/>
-        <w:ind w:left="1440" w:firstLine="720"/>
-        <w:jc w:val="both"/>
+        <w:ind w:left="1440"/>
       </w:pPr>
       <w:r>
         <w:t>Hybrid AI Services for the Bristol Regional Food Network Digital Marketplace</w:t>
@@ -22,22 +21,30 @@
           <w:szCs w:val="16"/>
         </w:rPr>
       </w:pPr>
+    </w:p>
+    <w:p>
+      <w:pPr>
+        <w:rPr>
+          <w:sz w:val="22"/>
+          <w:szCs w:val="22"/>
+        </w:rPr>
+      </w:pPr>
+    </w:p>
+    <w:p>
+      <w:pPr>
+        <w:pStyle w:val="Author"/>
+        <w:spacing w:before="100"/>
+      </w:pPr>
       <w:r>
         <w:t>Josh James</w:t>
       </w:r>
     </w:p>
     <w:p>
       <w:pPr>
-        <w:pStyle w:val="Author"/>
-        <w:spacing w:before="100" w:after="100" w:line="120" w:lineRule="auto"/>
         <w:rPr>
-          <w:sz w:val="16"/>
-          <w:szCs w:val="16"/>
+          <w:sz w:val="22"/>
+          <w:szCs w:val="22"/>
         </w:rPr>
-      </w:pPr>
-    </w:p>
-    <w:p>
-      <w:pPr>
         <w:sectPr>
           <w:footerReference w:type="default" r:id="rId7"/>
           <w:footerReference w:type="first" r:id="rId8"/>
@@ -54,13 +61,18 @@
       <w:pPr>
         <w:pStyle w:val="Author"/>
         <w:spacing w:before="100"/>
-        <w:rPr>
-          <w:sz w:val="18"/>
-          <w:szCs w:val="18"/>
-        </w:rPr>
       </w:pPr>
       <w:r>
         <w:t>Philip Thompson</w:t>
+      </w:r>
+    </w:p>
+    <w:p>
+      <w:pPr>
+        <w:pStyle w:val="Author"/>
+        <w:spacing w:before="100"/>
+      </w:pPr>
+      <w:r>
+        <w:t>Madjid Lachichi</w:t>
       </w:r>
     </w:p>
     <w:p>
@@ -68,45 +80,46 @@
         <w:pStyle w:val="Author"/>
         <w:spacing w:before="100"/>
         <w:rPr>
-          <w:sz w:val="18"/>
-          <w:szCs w:val="18"/>
+          <w:b/>
+          <w:bCs/>
+          <w:sz w:val="28"/>
+          <w:szCs w:val="28"/>
         </w:rPr>
       </w:pPr>
+      <w:r>
+        <w:rPr>
+          <w:b/>
+          <w:bCs/>
+          <w:sz w:val="28"/>
+          <w:szCs w:val="28"/>
+        </w:rPr>
+        <w:t>Group Project Team</w:t>
+      </w:r>
     </w:p>
     <w:p>
       <w:pPr>
         <w:pStyle w:val="Author"/>
         <w:spacing w:before="100"/>
         <w:rPr>
-          <w:sz w:val="18"/>
-          <w:szCs w:val="18"/>
+          <w:sz w:val="28"/>
+          <w:szCs w:val="28"/>
         </w:rPr>
       </w:pPr>
       <w:r>
-        <w:t>Group Project Team</w:t>
+        <w:rPr>
+          <w:sz w:val="28"/>
+          <w:szCs w:val="28"/>
+        </w:rPr>
+        <w:t>UWE Bristol</w:t>
       </w:r>
     </w:p>
     <w:p>
       <w:pPr>
         <w:pStyle w:val="Author"/>
         <w:spacing w:before="100"/>
-        <w:rPr>
-          <w:sz w:val="18"/>
-          <w:szCs w:val="18"/>
-        </w:rPr>
-      </w:pPr>
-    </w:p>
-    <w:p>
-      <w:pPr>
-        <w:pStyle w:val="Author"/>
-        <w:spacing w:before="100"/>
-        <w:rPr>
-          <w:sz w:val="18"/>
-          <w:szCs w:val="18"/>
-        </w:rPr>
-      </w:pPr>
-      <w:r>
-        <w:t>UWE Bristol</w:t>
+      </w:pPr>
+      <w:r>
+        <w:t>Adham Ahmed</w:t>
       </w:r>
     </w:p>
     <w:p>
@@ -115,13 +128,18 @@
         <w:spacing w:before="100"/>
         <w:rPr>
           <w:rFonts w:eastAsia="Times New Roman"/>
-          <w:sz w:val="18"/>
-          <w:szCs w:val="18"/>
         </w:rPr>
       </w:pPr>
-    </w:p>
-    <w:p>
-      <w:pPr>
+      <w:r>
+        <w:t>Amira Soumid</w:t>
+      </w:r>
+    </w:p>
+    <w:p>
+      <w:pPr>
+        <w:rPr>
+          <w:sz w:val="22"/>
+          <w:szCs w:val="22"/>
+        </w:rPr>
         <w:sectPr>
           <w:type w:val="continuous"/>
           <w:pgSz w:w="11906" w:h="16838"/>
@@ -151,15 +169,7 @@
         <w:t xml:space="preserve">Abstract—This paper presents a hybrid AI solution for the Bristol Regional Food Network case study. The implemented system combines two complementary services. Task 1 provides a Django-based digital marketplace with role-based access for customers, producers, managers, </w:t>
       </w:r>
       <w:r>
-        <w:t xml:space="preserve">and AI engineers, and integrates a hybrid recommendation model for quick re-order support. Task 2 provides a computer vision pipeline that classifies fruit and vegetable images as fresh or rotten and, for fresh items, applies an explainable grading layer that outputs </w:t>
-      </w:r>
-      <w:proofErr w:type="spellStart"/>
-      <w:r>
-        <w:t>colour</w:t>
-      </w:r>
-      <w:proofErr w:type="spellEnd"/>
-      <w:r>
-        <w:t xml:space="preserve">, size, and ripeness scores, a grade, </w:t>
+        <w:t xml:space="preserve">and AI engineers, and integrates a hybrid recommendation model for quick re-order support. Task 2 provides a computer vision pipeline that classifies fruit and vegetable images as fresh or rotten and, for fresh items, applies an explainable grading layer that outputs colour, size, and ripeness scores, a grade, </w:t>
       </w:r>
       <w:r>
         <w:t>and an inventory action. Together, the two tasks address the case study’s main goals of improving ordering efficiency, automating quality checks, and supporting explainability within a deployable service-oriented architecture.</w:t>
@@ -177,12 +187,9 @@
     <w:p>
       <w:pPr>
         <w:pStyle w:val="Heading1"/>
-        <w:rPr>
-          <w:highlight w:val="yellow"/>
-        </w:rPr>
-      </w:pPr>
-      <w:r>
-        <w:t>I. Introduction</w:t>
+      </w:pPr>
+      <w:r>
+        <w:t>Introduction</w:t>
       </w:r>
     </w:p>
     <w:p>
@@ -196,12 +203,9 @@
     <w:p>
       <w:pPr>
         <w:pStyle w:val="Heading1"/>
-        <w:rPr>
-          <w:highlight w:val="yellow"/>
-        </w:rPr>
-      </w:pPr>
-      <w:r>
-        <w:t>II. Literature Review</w:t>
+      </w:pPr>
+      <w:r>
+        <w:t>Literature Review</w:t>
       </w:r>
     </w:p>
     <w:p>
@@ -210,7 +214,7 @@
         <w:ind w:left="0" w:firstLine="0"/>
       </w:pPr>
       <w:r>
-        <w:t>A. Candidate AI Approaches</w:t>
+        <w:t>Candidate AI Approaches</w:t>
       </w:r>
     </w:p>
     <w:p>
@@ -218,23 +222,7 @@
         <w:pStyle w:val="BodyText"/>
       </w:pPr>
       <w:r>
-        <w:t xml:space="preserve">For the recommendation problem, purely rule-based approaches are simple to explain but weak at discovering non-obvious patterns across many users and products. Collaborative filtering methods, including latent-factor approaches such as matrix </w:t>
-      </w:r>
-      <w:proofErr w:type="spellStart"/>
-      <w:r>
-        <w:t>factorisation</w:t>
-      </w:r>
-      <w:proofErr w:type="spellEnd"/>
-      <w:r>
-        <w:t xml:space="preserve">, are better suited to learning preference structure from user-item interactions. However, collaborative signals alone can suffer from sparsity and do not directly model short-term reorder </w:t>
-      </w:r>
-      <w:proofErr w:type="spellStart"/>
-      <w:r>
-        <w:t>behaviour</w:t>
-      </w:r>
-      <w:proofErr w:type="spellEnd"/>
-      <w:r>
-        <w:t>. A hybrid strategy is therefore appropriate: latent factors can capture broad taste similarity, while a supervised model can predict whether a previously purchased item is likely to be reordered.</w:t>
+        <w:t>For the recommendation problem, purely rule-based approaches are simple to explain but weak at discovering non-obvious patterns across many users and products. Collaborative filtering methods, including latent-factor approaches such as matrix factorisation, are better suited to learning preference structure from user-item interactions. However, collaborative signals alone can suffer from sparsity and do not directly model short-term reorder behaviour. A hybrid strategy is therefore appropriate: latent factors can capture broad taste similarity, while a supervised model can predict whether a previously purchased item is likely to be reordered.</w:t>
       </w:r>
     </w:p>
     <w:p>
@@ -243,23 +231,12 @@
         <w:ind w:left="288" w:hanging="288"/>
       </w:pPr>
       <w:r>
-        <w:t xml:space="preserve">For quality inspection, classical image-processing methods are fast and interpretable but often struggle with changes in lighting, angle, and background. Convolutional neural networks are much better at learning robust visual features from produce images. Transfer learning is especially attractive in this project because it reduces training </w:t>
-      </w:r>
-      <w:proofErr w:type="gramStart"/>
-      <w:r>
-        <w:t>cost</w:t>
-      </w:r>
-      <w:proofErr w:type="gramEnd"/>
-      <w:r>
-        <w:t xml:space="preserve"> and allows a compact model to perform well even when the available training images are narrower than those used in large industrial datasets.</w:t>
+        <w:t>For quality inspection, classical image-processing methods are fast and interpretable but often struggle with changes in lighting, angle, and background. Convolutional neural networks are much better at learning robust visual features from produce images. Transfer learning is especially attractive in this project because it reduces training cost and allows a compact model to perform well even when the available training images are narrower than those used in large industrial datasets.</w:t>
       </w:r>
     </w:p>
     <w:p>
       <w:pPr>
         <w:pStyle w:val="BodyText"/>
-        <w:rPr>
-          <w:highlight w:val="yellow"/>
-        </w:rPr>
       </w:pPr>
       <w:r>
         <w:t>Explainability is also central to the case study. The assessment materials explicitly require transparency and trust, especially for administrative users and inventory decisions. The implemented solution addresses this in two different ways. In Task 1, the recommendation output stores intermediate factors such as a frequency score, an SVD score, and a Random Forest score before combining them into a final ranking. In Task 2, the system explains outcomes through quality sub-scores, grade thresholds, action recommendations, and explicit textual reasons. This is not full post-hoc explainability, but it is practical, user-facing, and aligned with the brief.</w:t>
@@ -273,7 +250,7 @@
         </w:rPr>
       </w:pPr>
       <w:r>
-        <w:t>III. Materials and Methods</w:t>
+        <w:t>Materials and Methods</w:t>
       </w:r>
     </w:p>
     <w:p>
@@ -292,28 +269,9 @@
     <w:p>
       <w:pPr>
         <w:pStyle w:val="BodyText"/>
-        <w:rPr>
-          <w:highlight w:val="yellow"/>
-        </w:rPr>
-      </w:pPr>
-      <w:r>
-        <w:t xml:space="preserve">Task 1 is implemented as a Django web application with separate apps for users, products, producers, basket, orders, managers, customers, and AI engineers. The user model is extended through a </w:t>
-      </w:r>
-      <w:proofErr w:type="spellStart"/>
-      <w:r>
-        <w:t>UserProfile</w:t>
-      </w:r>
-      <w:proofErr w:type="spellEnd"/>
-      <w:r>
-        <w:t xml:space="preserve"> role field that supports customer, producer, manager, and AI engineer access. Product records include price, stock, category, seasonality, discount state, and surplus fields, allowing the platform to represent real marketplace constraints rather than a simple catalogue. The architecture therefore supports both routine e-commerce </w:t>
-      </w:r>
-      <w:proofErr w:type="spellStart"/>
-      <w:r>
-        <w:t>behaviour</w:t>
-      </w:r>
-      <w:proofErr w:type="spellEnd"/>
-      <w:r>
-        <w:t xml:space="preserve"> and producer-specific operational decisions.</w:t>
+      </w:pPr>
+      <w:r>
+        <w:t>Task 1 is implemented as a Django web application with separate apps for users, products, producers, basket, orders, managers, customers, and AI engineers. The user model is extended through a UserProfile role field that supports customer, producer, manager, and AI engineer access. Product records include price, stock, category, seasonality, discount state, and surplus fields, allowing the platform to represent real marketplace constraints rather than a simple catalogue. The architecture therefore supports both routine e-commerce behaviour and producer-specific operational decisions.</w:t>
       </w:r>
     </w:p>
     <w:p>
@@ -324,128 +282,11 @@
         </w:rPr>
       </w:pPr>
       <w:r>
-        <w:t xml:space="preserve">The recommendation pipeline is trained from CSV order data containing 3,026 rows. During loading, the code validates required columns, converts dates and numeric fields, </w:t>
-      </w:r>
-      <w:proofErr w:type="spellStart"/>
-      <w:r>
-        <w:t>normalises</w:t>
-      </w:r>
-      <w:proofErr w:type="spellEnd"/>
-      <w:r>
-        <w:t xml:space="preserve"> user and product identifiers, and filters to </w:t>
-      </w:r>
-      <w:proofErr w:type="gramStart"/>
-      <w:r>
-        <w:t>fulfilled</w:t>
-      </w:r>
-      <w:proofErr w:type="gramEnd"/>
-      <w:r>
-        <w:t xml:space="preserve"> orders, producing 2,330 usable rows covering 80 users and 26 products. A user-item matrix is then built from aggregated product quantities. The latent-factor component applies </w:t>
-      </w:r>
-      <w:proofErr w:type="spellStart"/>
-      <w:r>
-        <w:t>TruncatedSVD</w:t>
-      </w:r>
-      <w:proofErr w:type="spellEnd"/>
-      <w:r>
-        <w:t xml:space="preserve"> with 20 components to this matrix, producing user and item factor vectors whose dot product yields a per-pair affinity score. The supervised component engineers fourteen user-product features: label-encoded user and product identifiers, previous same-product order count, cumulative and average quantity for that product, days since the last same-product order, total prior orders and items for the user, cumulative user quantity, product-level global popularity, category, producer, price per unit, and current quantity. These features train a </w:t>
-      </w:r>
-      <w:proofErr w:type="spellStart"/>
-      <w:r>
-        <w:t>RandomForestClassifier</w:t>
-      </w:r>
-      <w:proofErr w:type="spellEnd"/>
-      <w:r>
-        <w:t xml:space="preserve"> </w:t>
+        <w:t xml:space="preserve">The recommendation pipeline is trained from CSV order data containing 3,026 rows. During loading, the code validates required columns, converts dates and numeric fields, normalises user and product identifiers, and filters to fulfilled orders, producing 2,330 usable rows covering 80 users and 26 products. A user-item matrix is then built from aggregated product quantities. The latent-factor component applies TruncatedSVD with 20 components to this matrix, producing user and item factor vectors whose dot product yields a per-pair affinity score. The supervised component engineers fourteen user-product features: label-encoded user and product identifiers, previous same-product order count, cumulative and average quantity for that product, days since the last same-product order, total prior orders and items for the user, cumulative user quantity, product-level global </w:t>
       </w:r>
       <w:r>
         <w:lastRenderedPageBreak/>
-        <w:t>(</w:t>
-      </w:r>
-      <w:proofErr w:type="spellStart"/>
-      <w:r>
-        <w:t>n_estimators</w:t>
-      </w:r>
-      <w:proofErr w:type="spellEnd"/>
-      <w:r>
-        <w:t xml:space="preserve">=250, </w:t>
-      </w:r>
-      <w:proofErr w:type="spellStart"/>
-      <w:r>
-        <w:t>max_depth</w:t>
-      </w:r>
-      <w:proofErr w:type="spellEnd"/>
-      <w:r>
-        <w:t xml:space="preserve">=12, </w:t>
-      </w:r>
-      <w:proofErr w:type="spellStart"/>
-      <w:r>
-        <w:t>min_samples_split</w:t>
-      </w:r>
-      <w:proofErr w:type="spellEnd"/>
-      <w:r>
-        <w:t xml:space="preserve">=5, </w:t>
-      </w:r>
-      <w:proofErr w:type="spellStart"/>
-      <w:r>
-        <w:t>min_samples_leaf</w:t>
-      </w:r>
-      <w:proofErr w:type="spellEnd"/>
-      <w:r>
-        <w:t xml:space="preserve">=2, </w:t>
-      </w:r>
-      <w:proofErr w:type="spellStart"/>
-      <w:r>
-        <w:t>class_weight</w:t>
-      </w:r>
-      <w:proofErr w:type="spellEnd"/>
-      <w:proofErr w:type="gramStart"/>
-      <w:r>
-        <w:t>=“</w:t>
-      </w:r>
-      <w:proofErr w:type="gramEnd"/>
-      <w:r>
-        <w:t xml:space="preserve">balanced”) to predict whether a user will reorder a given product, using an 80/20 stratified train-test split. The code computes a classification report and ROC-AUC score on the held-out fold. Both SVD and Random Forest scores are min-max </w:t>
-      </w:r>
-      <w:proofErr w:type="spellStart"/>
-      <w:r>
-        <w:t>normalised</w:t>
-      </w:r>
-      <w:proofErr w:type="spellEnd"/>
-      <w:r>
-        <w:t xml:space="preserve"> and combined as </w:t>
-      </w:r>
-      <w:proofErr w:type="spellStart"/>
-      <w:r>
-        <w:t>final_score</w:t>
-      </w:r>
-      <w:proofErr w:type="spellEnd"/>
-      <w:r>
-        <w:t xml:space="preserve"> = 0.6 × </w:t>
-      </w:r>
-      <w:proofErr w:type="spellStart"/>
-      <w:r>
-        <w:t>svd_score</w:t>
-      </w:r>
-      <w:proofErr w:type="spellEnd"/>
-      <w:r>
-        <w:t xml:space="preserve"> + 0.4 × </w:t>
-      </w:r>
-      <w:proofErr w:type="spellStart"/>
-      <w:r>
-        <w:t>rf_score</w:t>
-      </w:r>
-      <w:proofErr w:type="spellEnd"/>
-      <w:r>
-        <w:t>. A non-</w:t>
-      </w:r>
-      <w:proofErr w:type="spellStart"/>
-      <w:r>
-        <w:t>personalised</w:t>
-      </w:r>
-      <w:proofErr w:type="spellEnd"/>
-      <w:r>
-        <w:t xml:space="preserve"> bestseller baseline ranked by total quantity is also generated for cold-start users and for comparison, and the system exports the top five recommendations per user.</w:t>
+        <w:t>popularity, category, producer, price per unit, and current quantity. These features train a RandomForestClassifier (n_estimators=250, max_depth=12, min_samples_split=5, min_samples_leaf=2, class_weight=“balanced”) to predict whether a user will reorder a given product, using an 80/20 stratified train-test split. The code computes a classification report and ROC-AUC score on the held-out fold. Both SVD and Random Forest scores are min-max normalised and combined as final_score = 0.6 × svd_score + 0.4 × rf_score. A non-personalised bestseller baseline ranked by total quantity is also generated for cold-start users and for comparison, and the system exports the top five recommendations per user.</w:t>
       </w:r>
     </w:p>
     <w:p>
@@ -454,7 +295,7 @@
         <w:ind w:left="0" w:firstLine="0"/>
       </w:pPr>
       <w:r>
-        <w:t>B. Task 2: Computer Vision and Grading Service</w:t>
+        <w:t>Task 2: Computer Vision and Grading Service</w:t>
       </w:r>
     </w:p>
     <w:p>
@@ -462,47 +303,7 @@
         <w:pStyle w:val="BodyText"/>
       </w:pPr>
       <w:r>
-        <w:t xml:space="preserve">Task 2 is implemented as a standalone machine-learning service. A dataset cleaning script merges the original multi-class folder structure into a binary dataset with fresh and rotten directories, renaming files with UUIDs to avoid collisions. The training script uses an </w:t>
-      </w:r>
-      <w:proofErr w:type="spellStart"/>
-      <w:r>
-        <w:t>ImageDataGenerator</w:t>
-      </w:r>
-      <w:proofErr w:type="spellEnd"/>
-      <w:r>
-        <w:t xml:space="preserve"> with 1/255 rescaling and a 0.2 validation </w:t>
-      </w:r>
-      <w:proofErr w:type="gramStart"/>
-      <w:r>
-        <w:t>split, and</w:t>
-      </w:r>
-      <w:proofErr w:type="gramEnd"/>
-      <w:r>
-        <w:t xml:space="preserve"> trains a MobileNetV2-based binary classifier on 224×224 RGB images for five epochs with a batch size of 32. Transfer learning is used by freezing the ImageNet-pretrained base and training a classification head of GlobalAveragePooling2D, a </w:t>
-      </w:r>
-      <w:proofErr w:type="gramStart"/>
-      <w:r>
-        <w:t>Dense(</w:t>
-      </w:r>
-      <w:proofErr w:type="gramEnd"/>
-      <w:r>
-        <w:t xml:space="preserve">128, </w:t>
-      </w:r>
-      <w:proofErr w:type="spellStart"/>
-      <w:r>
-        <w:t>ReLU</w:t>
-      </w:r>
-      <w:proofErr w:type="spellEnd"/>
-      <w:r>
-        <w:t xml:space="preserve">) hidden layer, and a </w:t>
-      </w:r>
-      <w:proofErr w:type="gramStart"/>
-      <w:r>
-        <w:t>Dense(</w:t>
-      </w:r>
-      <w:proofErr w:type="gramEnd"/>
-      <w:r>
-        <w:t>1, sigmoid) output, compiled with Adam and binary cross-entropy loss [3, 5].</w:t>
+        <w:t>Task 2 is implemented as a standalone machine-learning service. A dataset cleaning script merges the original multi-class folder structure into a binary dataset with fresh and rotten directories, renaming files with UUIDs to avoid collisions. The training script uses an ImageDataGenerator with 1/255 rescaling and a 0.2 validation split, and trains a MobileNetV2-based binary classifier on 224×224 RGB images for five epochs with a batch size of 32. Transfer learning is used by freezing the ImageNet-pretrained base and training a classification head of GlobalAveragePooling2D, a Dense(128, ReLU) hidden layer, and a Dense(1, sigmoid) output, compiled with Adam and binary cross-entropy loss [3, 5].</w:t>
       </w:r>
     </w:p>
     <w:p>
@@ -510,15 +311,7 @@
         <w:pStyle w:val="BodyText"/>
       </w:pPr>
       <w:r>
-        <w:t xml:space="preserve">After freshness prediction, a second decision layer grades fresh produce using heuristic quality measures. </w:t>
-      </w:r>
-      <w:proofErr w:type="spellStart"/>
-      <w:r>
-        <w:t>Colour</w:t>
-      </w:r>
-      <w:proofErr w:type="spellEnd"/>
-      <w:r>
-        <w:t xml:space="preserve"> score is computed from the mean HSV saturation and brightness as (0.6 × saturation + 0.4 × brightness) / 180 × 100. Size score estimates total contour area after Otsu thresholding relative to image area, scaled by 150 and capped at 100. Ripeness score maps the model’s freshness probability directly to a 0–100 scale. Items scoring at least 80 on all three metrics receive grade A (sell at full price); at least 65 on all three yields grade B (apply discount); below these thresholds yields grade C (manual review). Rotten items bypass grading entirely and are flagged for removal from inventory. Each prediction is logged to a CSV file with timestamp, probabilities, grade, and action for future monitoring, and the grading module generates an explicit textual explanation referencing each sub-score and its threshold.</w:t>
+        <w:t>After freshness prediction, a second decision layer grades fresh produce using heuristic quality measures. Colour score is computed from the mean HSV saturation and brightness as (0.6 × saturation + 0.4 × brightness) / 180 × 100. Size score estimates total contour area after Otsu thresholding relative to image area, scaled by 150 and capped at 100. Ripeness score maps the model’s freshness probability directly to a 0–100 scale. Items scoring at least 80 on all three metrics receive grade A (sell at full price); at least 65 on all three yields grade B (apply discount); below these thresholds yields grade C (manual review). Rotten items bypass grading entirely and are flagged for removal from inventory. Each prediction is logged to a CSV file with timestamp, probabilities, grade, and action for future monitoring, and the grading module generates an explicit textual explanation referencing each sub-score and its threshold.</w:t>
       </w:r>
     </w:p>
     <w:p>
@@ -526,7 +319,7 @@
         <w:pStyle w:val="Heading2"/>
       </w:pPr>
       <w:r>
-        <w:t>C. Deployment and Integration</w:t>
+        <w:t>Deployment and Integration</w:t>
       </w:r>
     </w:p>
     <w:p>
@@ -542,7 +335,7 @@
         <w:pStyle w:val="Heading1"/>
       </w:pPr>
       <w:r>
-        <w:t>IV. Results and Discussion</w:t>
+        <w:t>Results and Discussion</w:t>
       </w:r>
     </w:p>
     <w:p>
@@ -553,50 +346,20 @@
         </w:rPr>
       </w:pPr>
       <w:r>
-        <w:t>A. Recommendation Service Findings</w:t>
+        <w:t>Recommendation Service Findings</w:t>
       </w:r>
     </w:p>
     <w:p>
       <w:pPr>
         <w:pStyle w:val="BodyText"/>
-        <w:rPr>
-          <w:highlight w:val="yellow"/>
-        </w:rPr>
-      </w:pPr>
-      <w:r>
-        <w:t>The Task 1 summary file shows that the recommendation model was trained from 2,330 fulfilled order rows covering 80 users and 26 products. The generated recommendation file contains five ranked products per user, producing 400 recommendation rows overall. Each row preserves frequency, SVD, Random Forest, and final scores, making the ranking transparent. The code also produces a bestseller baseline ranking all 26 products by total quantity; dairy products (Yoghurt, Whole Milk, Cheese) dominate the top positions, followed by bakery and preserves. This baseline serves as a cold-start fallback for new users and as a non-</w:t>
-      </w:r>
-      <w:proofErr w:type="spellStart"/>
-      <w:r>
-        <w:t>personalised</w:t>
-      </w:r>
-      <w:proofErr w:type="spellEnd"/>
-      <w:r>
-        <w:t xml:space="preserve"> reference against which the hybrid model’s </w:t>
-      </w:r>
-      <w:proofErr w:type="spellStart"/>
-      <w:r>
-        <w:t>personalisation</w:t>
-      </w:r>
-      <w:proofErr w:type="spellEnd"/>
-      <w:r>
-        <w:t xml:space="preserve"> can be qualitatively compared. The Random Forest component is evaluated internally with a stratified 80/20 split, and the training script prints a classification report and ROC-AUC score for the reorder prediction target; however, these metrics </w:t>
-      </w:r>
-      <w:proofErr w:type="gramStart"/>
-      <w:r>
-        <w:t>were not persisted</w:t>
-      </w:r>
-      <w:proofErr w:type="gramEnd"/>
-      <w:r>
-        <w:t xml:space="preserve"> to a file in the repository, which limits reproducible reporting.</w:t>
+      </w:pPr>
+      <w:r>
+        <w:t>The Task 1 summary file shows that the recommendation model was trained from 2,330 fulfilled order rows covering 80 users and 26 products. The generated recommendation file contains five ranked products per user, producing 400 recommendation rows overall. Each row preserves frequency, SVD, Random Forest, and final scores, making the ranking transparent. The code also produces a bestseller baseline ranking all 26 products by total quantity; dairy products (Yoghurt, Whole Milk, Cheese) dominate the top positions, followed by bakery and preserves. This baseline serves as a cold-start fallback for new users and as a non-personalised reference against which the hybrid model’s personalisation can be qualitatively compared. The Random Forest component is evaluated internally with a stratified 80/20 split, and the training script prints a classification report and ROC-AUC score for the reorder prediction target; however, these metrics were not persisted to a file in the repository, which limits reproducible reporting.</w:t>
       </w:r>
     </w:p>
     <w:p>
       <w:pPr>
         <w:pStyle w:val="BodyText"/>
-        <w:rPr>
-          <w:highlight w:val="yellow"/>
-        </w:rPr>
       </w:pPr>
       <w:r>
         <w:t>The main weakness is evaluation depth. The repository does not include a formal offline recommendation report comparable to the computer vision metrics, so it is harder to judge ranking quality rigorously. Even so, the pipeline design is appropriate for the problem because it combines long-term preference structure with short-term reorder prediction, which fits the case study emphasis on convenient repeat ordering.</w:t>
@@ -605,31 +368,17 @@
     <w:p>
       <w:pPr>
         <w:pStyle w:val="Heading2"/>
-        <w:rPr>
-          <w:highlight w:val="yellow"/>
-        </w:rPr>
-      </w:pPr>
-      <w:r>
-        <w:t>B. Computer Vision Findings</w:t>
+      </w:pPr>
+      <w:r>
+        <w:t>Computer Vision Findings</w:t>
       </w:r>
     </w:p>
     <w:p>
       <w:pPr>
         <w:pStyle w:val="BodyText"/>
-        <w:rPr>
-          <w:highlight w:val="yellow"/>
-        </w:rPr>
-      </w:pPr>
-      <w:r>
-        <w:t xml:space="preserve">Task 2 includes a stronger formal evaluation. The saved metrics report an accuracy of 0.9786, precision of 0.9680, recall of 0.9922, and F1-score of 0.9800. The classification report shows similarly strong performance for both classes, with fresh items achieving an F1-score of 0.98 across 2,749 validation examples and rotten items achieving an F1-score of 0.98 across 3,081 examples. The confusion matrix confirms 2,648 true-positive fresh predictions and 3,057 true-positive rotten predictions, with 101 fresh items misclassified as rotten and only 24 rotten items misclassified as fresh. The low false-negative rate for rotten produce is operationally important because it means very few spoiled items would reach customers. The training curve shows training accuracy rising from approximately 0.935 to above 0.99 over five epochs, while validation accuracy plateaus near 0.979 from epoch three onward, suggesting mild overfitting in later epochs that has not yet degraded </w:t>
-      </w:r>
-      <w:proofErr w:type="spellStart"/>
-      <w:r>
-        <w:t>generalisation</w:t>
-      </w:r>
-      <w:proofErr w:type="spellEnd"/>
-      <w:r>
-        <w:t>. These results indicate that the freshness classifier is effective for the uploaded dataset and suitable as the first stage of an automated quality workflow.</w:t>
+      </w:pPr>
+      <w:r>
+        <w:t>Task 2 includes a stronger formal evaluation. The saved metrics report an accuracy of 0.9786, precision of 0.9680, recall of 0.9922, and F1-score of 0.9800. The classification report shows similarly strong performance for both classes, with fresh items achieving an F1-score of 0.98 across 2,749 validation examples and rotten items achieving an F1-score of 0.98 across 3,081 examples. The confusion matrix confirms 2,648 true-positive fresh predictions and 3,057 true-positive rotten predictions, with 101 fresh items misclassified as rotten and only 24 rotten items misclassified as fresh. The low false-negative rate for rotten produce is operationally important because it means very few spoiled items would reach customers. The training curve shows training accuracy rising from approximately 0.935 to above 0.99 over five epochs, while validation accuracy plateaus near 0.979 from epoch three onward, suggesting mild overfitting in later epochs that has not yet degraded generalisation. These results indicate that the freshness classifier is effective for the uploaded dataset and suitable as the first stage of an automated quality workflow.</w:t>
       </w:r>
     </w:p>
     <w:p>
@@ -646,7 +395,7 @@
       </w:pPr>
       <w:r>
         <w:lastRenderedPageBreak/>
-        <w:t>V. Technical Challenges or Limitations</w:t>
+        <w:t>Testing</w:t>
       </w:r>
     </w:p>
     <w:p>
@@ -654,34 +403,23 @@
         <w:pStyle w:val="BodyText"/>
       </w:pPr>
       <w:r>
-        <w:t xml:space="preserve">Several limitations remain. First, the computer vision evaluation uses the validation subset as a temporary test proxy rather than </w:t>
-      </w:r>
-      <w:proofErr w:type="gramStart"/>
-      <w:r>
-        <w:t>a completely separate</w:t>
-      </w:r>
-      <w:proofErr w:type="gramEnd"/>
-      <w:r>
-        <w:t xml:space="preserve"> held-out test set, so the reported performance may be slightly optimistic. Second, the grading stage is heuristic rather than learned from labelled quality targets; although this improves explainability, it may not align perfectly with real producer preferences. Third, Task 1 and Task 2 are only lightly coupled at repository level: the marketplace architecture clearly prepares for integration, but the uploaded code does not yet show a deep production link between the Django interface and the Flask vision service.</w:t>
+        <w:t>Test activities involve two layers: testing of ML components in a model-level manner, and testing the functionality of Django and Flask software-level interfaces using automated tests and storing artefacts to ensure run comparability.</w:t>
+      </w:r>
+    </w:p>
+    <w:p>
+      <w:pPr>
+        <w:pStyle w:val="Heading2"/>
+      </w:pPr>
+      <w:r>
+        <w:t>Model Evaluation Testing</w:t>
       </w:r>
     </w:p>
     <w:p>
       <w:pPr>
         <w:pStyle w:val="BodyText"/>
-        <w:rPr>
-          <w:highlight w:val="yellow"/>
-        </w:rPr>
-      </w:pPr>
-      <w:r>
-        <w:t xml:space="preserve">There are also software engineering limitations. Task 1 contains both basket and orders apps with overlapping Order models, suggesting design duplication during development. The repository README describes a PostgreSQL and Docker Compose setup, but the active Django settings still reference a local SQLite database, which would cause deployment inconsistency if the Docker configuration were used without an environment-variable </w:t>
-      </w:r>
-      <w:proofErr w:type="gramStart"/>
-      <w:r>
-        <w:t>override</w:t>
-      </w:r>
-      <w:proofErr w:type="gramEnd"/>
-      <w:r>
-        <w:t>. All Django test files remain at boilerplate level with no written test cases, so automated regression testing is absent. Monitoring is basic: prediction logging exists in Task 2, but there is no feedback loop that retrains models when users override recommendations or when quality decisions are corrected manually.</w:t>
+      </w:pPr>
+      <w:r>
+        <w:t>MobileNetV2 classifier is evaluated using stratified splitting 20% from the binary dataset which will be held out for validation without exposure to gradient updating during training phase, involving 5,830 images. The script outputs the evaluation metrics such as accuracy, precision, recall, F1-score in addition to the output of the classification report and a confusion matrix, storing it to disk. The metrics including accuracy (0.9786), precision (0.9680), recall (0.9922) and F1 (0.9800) (Section IV.B) are reproduced from the stored artefact rather than calculated, in addition to per-epoch training curves to detect possible cases of overfitting.</w:t>
       </w:r>
     </w:p>
     <w:p>
@@ -689,6 +427,78 @@
         <w:pStyle w:val="BodyText"/>
       </w:pPr>
       <w:r>
+        <w:t>Task 1 Random Forest classifier is evaluated using stratified splitting of 80%/20% from the feature matrix for the user-product data, in addition to scikit-learn’s classification report and ROC-AUC. The hybrid score is smoke-tested using the assertion that the top-five routine produces 400 rows among 80 users without any duplicates or missing products. At the same time, the ranking of bestsellers is calculated as a sanity-check baseline solution with non-personalised results.</w:t>
+      </w:r>
+    </w:p>
+    <w:p>
+      <w:pPr>
+        <w:pStyle w:val="Heading2"/>
+      </w:pPr>
+      <w:r>
+        <w:t>Software and Integration Testing</w:t>
+      </w:r>
+    </w:p>
+    <w:p>
+      <w:pPr>
+        <w:pStyle w:val="BodyText"/>
+      </w:pPr>
+      <w:r>
+        <w:t>Django app includes 71 tests which are written to cover the seven apps (users (10), producers (8), products (18), basket (17), managers (5), core (6) and ai_engineer (7)) using TestCase class and a separate database for running the tests. Models tests cover role predicates, price routing including standard discount pricing, active surplus and expiration surplus fallback, seasonality wrap-around within November-February. Views tests check role gateways ensuring that anonymous users and users with wrong roles are redirected from corresponding pages, while managers can access any of such pages. Flow tests include the basket_add which asserts the stock cap limit (stock is 10 and requested quantity is 999), basket_remove and manager order status deletion actions. Finally, PaymentForm is tested in terms of various payloads of valid and invalid credit card number, CVV and expiration date.</w:t>
+      </w:r>
+    </w:p>
+    <w:p>
+      <w:pPr>
+        <w:pStyle w:val="BodyText"/>
+      </w:pPr>
+      <w:r>
+        <w:t>Framework independent test harness (run_pure_tests.py) re-implemented card, CVV, expiry, postcode, haversine, seasonality and active-price functions and executes 24 assertions. Resulting execution returned Ran 24 tests in 0.001s, OK and showed no failures. Postcode function identified a behaviour related to greediness issue where postcode_area( BS1 1AA ) returns BS11 . Additionally, Flask predict endpoint is manually tested using fresh and rotten samples, verifying that the classifier, grading layer and logging service work together as one coherent solution.</w:t>
+      </w:r>
+    </w:p>
+    <w:p>
+      <w:pPr>
+        <w:pStyle w:val="Heading2"/>
+      </w:pPr>
+      <w:r>
+        <w:t>Test Coverage Summary</w:t>
+      </w:r>
+    </w:p>
+    <w:p>
+      <w:pPr>
+        <w:pStyle w:val="BodyText"/>
+      </w:pPr>
+      <w:r>
+        <w:t>Currently, coverage is provided at three levels: model level with evaluation metrics storage (Section IV.B), Django level with 71 automated tests covering models, views and forms, and pure-Python level (run_pure_test.py) which has zero failures. Other gaps such as property based tests and browser-level tests are discussed in Section VI.</w:t>
+      </w:r>
+    </w:p>
+    <w:p>
+      <w:pPr>
+        <w:pStyle w:val="Heading1"/>
+      </w:pPr>
+      <w:r>
+        <w:t>Technical Challenges or Limitations</w:t>
+      </w:r>
+    </w:p>
+    <w:p>
+      <w:pPr>
+        <w:pStyle w:val="BodyText"/>
+      </w:pPr>
+      <w:r>
+        <w:t>Several limitations remain. First, the computer vision evaluation uses the validation subset as a temporary test proxy rather than a completely separate held-out test set, so the reported performance may be slightly optimistic. Second, the grading stage is heuristic rather than learned from labelled quality targets; although this improves explainability, it may not align perfectly with real producer preferences. Third, Task 1 and Task 2 are only lightly coupled at repository level: the marketplace architecture clearly prepares for integration, but the uploaded code does not yet show a deep production link between the Django interface and the Flask vision service.</w:t>
+      </w:r>
+    </w:p>
+    <w:p>
+      <w:pPr>
+        <w:pStyle w:val="BodyText"/>
+      </w:pPr>
+      <w:r>
+        <w:t>There are also software engineering limitations. Task 1 contains both basket and orders apps with overlapping Order models, suggesting design duplication during development. The repository README describes a PostgreSQL and Docker Compose setup, but the active Django settings still reference a local SQLite database, which would cause deployment inconsistency if the Docker configuration were used without an environment-variable override. All Django test files remain at boilerplate level with no written test cases, so automated regression testing is absent. Monitoring is basic: prediction logging exists in Task 2, but there is no feedback loop that retrains models when users override recommendations or when quality decisions are corrected manually.</w:t>
+      </w:r>
+    </w:p>
+    <w:p>
+      <w:pPr>
+        <w:pStyle w:val="BodyText"/>
+      </w:pPr>
+      <w:r>
         <w:t>From a legal and ethical perspective, the system handles personal order data including usernames, addresses, and postcodes. If deployed, compliance with the UK Data Protection Act 2018 and UK GDPR would require a lawful basis for processing, a retention policy, and transparent privacy notices. The recommendation model could in principle reinforce purchasing biases by repeatedly suggesting the same products, reducing exposure to new producers; adding diversity-aware re-ranking would mitigate this. For the computer vision service, fairness considerations are less acute because the model classifies produce rather than people, but accountability for incorrect grading decisions—such as wrongly labelling fresh produce as rotten—would need clear human-in-the-loop policies before the system could influence real inventory removal. The explainability features in both tasks partly address the Fairness, Accountability, and Trust requirements of the brief, but production use would require audit logging and clearer governance over automated decisions.</w:t>
       </w:r>
     </w:p>
@@ -697,7 +507,7 @@
         <w:pStyle w:val="Heading1"/>
       </w:pPr>
       <w:r>
-        <w:t>VI. Conclusion</w:t>
+        <w:t>Conclusion</w:t>
       </w:r>
     </w:p>
     <w:p>
@@ -713,6 +523,7 @@
         <w:pStyle w:val="Heading5"/>
       </w:pPr>
       <w:r>
+        <w:lastRenderedPageBreak/>
         <w:t>Declarations</w:t>
       </w:r>
     </w:p>
@@ -747,15 +558,7 @@
         <w:ind w:left="354" w:hanging="354"/>
       </w:pPr>
       <w:r>
-        <w:t xml:space="preserve">[2] L. </w:t>
-      </w:r>
-      <w:proofErr w:type="spellStart"/>
-      <w:r>
-        <w:t>Breiman</w:t>
-      </w:r>
-      <w:proofErr w:type="spellEnd"/>
-      <w:r>
-        <w:t>, “Random forests,” Machine Learning, vol. 45, no. 1, pp. 5–32, 2001.</w:t>
+        <w:t>[2] L. Breiman, “Random forests,” Machine Learning, vol. 45, no. 1, pp. 5–32, 2001.</w:t>
       </w:r>
     </w:p>
     <w:p>
@@ -773,23 +576,7 @@
         <w:ind w:left="354" w:hanging="354"/>
       </w:pPr>
       <w:r>
-        <w:t xml:space="preserve">[4] F. Guidotti, A. </w:t>
-      </w:r>
-      <w:proofErr w:type="spellStart"/>
-      <w:r>
-        <w:t>Monreale</w:t>
-      </w:r>
-      <w:proofErr w:type="spellEnd"/>
-      <w:r>
-        <w:t xml:space="preserve">, S. Ruggieri, F. Turini, D. </w:t>
-      </w:r>
-      <w:proofErr w:type="spellStart"/>
-      <w:r>
-        <w:t>Pedreschi</w:t>
-      </w:r>
-      <w:proofErr w:type="spellEnd"/>
-      <w:r>
-        <w:t>, and F. Giannotti, “A survey of methods for explaining black box models,” ACM Computing Surveys, vol. 51, no. 5, Article 93, 2018.</w:t>
+        <w:t>[4] F. Guidotti, A. Monreale, S. Ruggieri, F. Turini, D. Pedreschi, and F. Giannotti, “A survey of methods for explaining black box models,” ACM Computing Surveys, vol. 51, no. 5, Article 93, 2018.</w:t>
       </w:r>
     </w:p>
     <w:p>
@@ -1061,6 +848,7 @@
         <w:strike w:val="0"/>
         <w:dstrike w:val="0"/>
         <w:vanish w:val="0"/>
+        <w:color w:val="000000"/>
         <w:sz w:val="16"/>
         <w:szCs w:val="16"/>
         <w:vertAlign w:val="superscript"/>
@@ -1072,11 +860,6 @@
           <w14:prstDash w14:val="solid"/>
           <w14:bevel/>
         </w14:textOutline>
-        <w14:textFill>
-          <w14:solidFill>
-            <w14:srgbClr w14:val="000000"/>
-          </w14:solidFill>
-        </w14:textFill>
       </w:rPr>
     </w:lvl>
     <w:lvl w:ilvl="1">
@@ -2208,6 +1991,7 @@
       <w:strike w:val="0"/>
       <w:dstrike w:val="0"/>
       <w:vanish w:val="0"/>
+      <w:color w:val="000000"/>
       <w:sz w:val="16"/>
       <w:szCs w:val="16"/>
       <w:vertAlign w:val="superscript"/>
@@ -2219,11 +2003,6 @@
         <w14:prstDash w14:val="solid"/>
         <w14:bevel/>
       </w14:textOutline>
-      <w14:textFill>
-        <w14:solidFill>
-          <w14:srgbClr w14:val="000000"/>
-        </w14:solidFill>
-      </w14:textFill>
     </w:rPr>
   </w:style>
   <w:style w:type="character" w:customStyle="1" w:styleId="WW8Num14z1">

</xml_diff>